<commit_message>
Sync the docx guides' embedded prompt copy to the current rules
The page-3 prompt block in both EN and HR versions was still on the
pre-N/A-explicit, pre-vanjski wording (the deferred finding from the
plan's final review), and was also missing "Dominik Filipčić" the
same way the .md and .gs copies were before today's fixes.

Added the "Update if Contradictory or Filling a Blank" wording, the
"External Guides" (vanjski) rule, the Cross-Reference exception
clause, and the corrected/alphabetized Master Guide List — matching
guide-name-correction.md and guide-matching.gs exactly. Verified via
validate.py (paragraph count unchanged, XSD-clean) and by rendering
both files to PDF/JPEG and reading the actual pages.

Co-Authored-By: Claude Sonnet 5 <noreply@anthropic.com>
</commit_message>
<xml_diff>
--- a/guides/Guide Matching - N-A Resolution (EN).docx
+++ b/guides/Guide Matching - N-A Resolution (EN).docx
@@ -315,11 +315,15 @@
         <w:br/>
         <w:t xml:space="preserve"/>
         <w:br/>
-        <w:t xml:space="preserve">Update if Contradictory: If the review explicitly names a guide that is clearly different from the one in the Guide column, you must update the Guide name to the correct one.</w:t>
-        <w:br/>
-        <w:t xml:space="preserve"/>
-        <w:br/>
-        <w:t xml:space="preserve">Cross-Reference: When correcting a name, you MUST pick the valid full name from the provided "Master Guide List" below. Ensure the new guide matches the City code in the data (du = Dubrovnik, zg = Zagreb, zd = Zadar, st = Split).</w:t>
+        <w:t xml:space="preserve">Update if Contradictory or Filling a Blank: If the review explicitly names a guide that is clearly different from the one in the Guide column, including when the Guide column is "N/A" and the review names anyone at all, you must update the Guide name to the correct one.</w:t>
+        <w:br/>
+        <w:t xml:space="preserve"/>
+        <w:br/>
+        <w:t xml:space="preserve">External Guides: If the review describes a guide who is clearly external, subcontracted, or freelance (not a member of the regular team) rather than a typo or alias of someone on the Master Guide List, write "vanjski" as the corrected value instead of picking a name from the list.</w:t>
+        <w:br/>
+        <w:t xml:space="preserve"/>
+        <w:br/>
+        <w:t xml:space="preserve">Cross-Reference: When correcting a name, you MUST pick the valid full name from the provided "Master Guide List" below, unless the External Guides rule above applies. Ensure the new guide matches the City code in the data (du = Dubrovnik, zg = Zagreb, zd = Zadar, st = Split).</w:t>
         <w:br/>
         <w:t xml:space="preserve"/>
         <w:br/>
@@ -331,19 +335,19 @@
         <w:br/>
         <w:t xml:space="preserve"/>
         <w:br/>
-        <w:t xml:space="preserve">Zagreb (zg): Antonio Sičić, Darko Crnolatac, Diana Bolić, Dora Mlinarek Dominik, Doris Cvetko Pavišić, Ena Matacun, Iva Pavlović, Ivana Čakarić, Josipa Šiklić, Katarina Novoselac, Katija Crnčević, Kristina Božić, Luka Pelicarić, Nadir Ivanović, Nikolina Folnović, Vid Dorić</w:t>
-        <w:br/>
-        <w:t xml:space="preserve"/>
-        <w:br/>
-        <w:t xml:space="preserve">Zadar (zd): Andrija Grubić, Tonka Baričević, Matea Duka, Iva Zaplatić, Nikolina Kuzman</w:t>
-        <w:br/>
-        <w:t xml:space="preserve"/>
-        <w:br/>
-        <w:t xml:space="preserve">Split (st): Bruno Beara, Ivana Čagalj, Boris Čerina, Lorena Ćelić, Marina Krolo, Petra Lučev, Marija Močić</w:t>
-        <w:br/>
-        <w:t xml:space="preserve"/>
-        <w:br/>
-        <w:t xml:space="preserve">Dubrovnik (du): Lorena Arias, Marin Kalauz, Pero Kusalo, Ivo Miličić, Maja Musulin, Andrea Rendulić, Nikolina Vidojević, Sara Žanetić, Romana Tomičić</w:t>
+        <w:t xml:space="preserve">Zagreb (zg): Antonio Sičić, Darko Crnolatac, Diana Bolić, Dominik Filipčić, Dora Mlinarek Dominik, Doris Cvetko Pavišić, Ena Matacun, Iva Pavlović, Ivana Čakarić, Josipa Šiklić, Katarina Novoselac, Katija Crnčević, Kristina Božić, Luka Pelicarić, Nadir Ivanović, Nikolina Folnović, Vid Dorić</w:t>
+        <w:br/>
+        <w:t xml:space="preserve"/>
+        <w:br/>
+        <w:t xml:space="preserve">Zadar (zd): Andrija Grubić, Iva Zaplatić, Matea Duka, Nikolina Kuzman, Tonka Baričević</w:t>
+        <w:br/>
+        <w:t xml:space="preserve"/>
+        <w:br/>
+        <w:t xml:space="preserve">Split (st): Boris Čerina, Bruno Beara, Ivana Čagalj, Lorena Ćelić, Marija Močić, Marina Krolo, Petra Lučev</w:t>
+        <w:br/>
+        <w:t xml:space="preserve"/>
+        <w:br/>
+        <w:t xml:space="preserve">Dubrovnik (du): Andrea Rendulić, Ivo Miličić, Lorena Arias, Maja Musulin, Marin Kalauz, Nikolina Vidojević, Pero Kusalo, Romana Tomičić, Sara Žanetić</w:t>
         <w:br/>
         <w:t xml:space="preserve"/>
         <w:br/>

</xml_diff>